<commit_message>
Implement toatool v0.1.0: deterministic local-first TOA generator
Full pipeline (parse → eyecite + supplemental recognizer → measured
fixed-point render loop → 8 TT rules → REPORT_SPEC report → CLI),
reproducing the PRD §20 oracle. 168 tests, 97.87% coverage.
</commit_message>
<xml_diff>
--- a/examples/briefs/clean_appellate_brief.docx
+++ b/examples/briefs/clean_appellate_brief.docx
@@ -140,144 +140,112 @@
         <w:t xml:space="preserve">TABLE OF AUTHORITIES</w:t>
       </w:r>
     </w:p>
-    <w:p>
-      <w:pPr>
-        <w:pStyle w:val="FirstParagraph"/>
-      </w:pPr>
-      <w:r>
-        <w:rPr>
-          <w:iCs/>
-          <w:i/>
-          <w:bCs/>
-          <w:b/>
-        </w:rPr>
-        <w:t xml:space="preserve">Cases</w:t>
-      </w:r>
-    </w:p>
-    <w:p>
-      <w:pPr>
-        <w:pStyle w:val="SourceCode"/>
-      </w:pPr>
-      <w:r>
-        <w:rPr>
-          <w:rStyle w:val="VerbatimChar"/>
-        </w:rPr>
-        <w:t xml:space="preserve">Brunner v. Caldwell, 344 P.3d 901 (Wash. 2015)  6, 7</w:t>
-      </w:r>
-      <w:r>
-        <w:br/>
-      </w:r>
-      <w:r>
-        <w:br/>
-      </w:r>
-      <w:r>
-        <w:rPr>
-          <w:rStyle w:val="VerbatimChar"/>
-        </w:rPr>
-        <w:t xml:space="preserve">Carmody v. Westfall Transit Auth., 512 F.3d 1042 (9th Cir. 2018)    2, 3, 4, 5, 6</w:t>
-      </w:r>
-      <w:r>
-        <w:br/>
-      </w:r>
-      <w:r>
-        <w:br/>
-      </w:r>
-      <w:r>
-        <w:rPr>
-          <w:rStyle w:val="VerbatimChar"/>
-        </w:rPr>
-        <w:t xml:space="preserve">Delgado v. Pinewood Credit Services, Inc., 487 U.S. 213 (1988)  3, 5</w:t>
-      </w:r>
-      <w:r>
-        <w:br/>
-      </w:r>
-      <w:r>
-        <w:br/>
-      </w:r>
-      <w:r>
-        <w:rPr>
-          <w:rStyle w:val="VerbatimChar"/>
-        </w:rPr>
-        <w:t xml:space="preserve">Hartwell Industries v. National Labor Relations Board, 723 F.2d 388 (2d Cir. 1984)  4</w:t>
-      </w:r>
-    </w:p>
-    <w:p>
-      <w:pPr>
-        <w:pStyle w:val="FirstParagraph"/>
-      </w:pPr>
-      <w:r>
-        <w:rPr>
-          <w:iCs/>
-          <w:i/>
-          <w:bCs/>
-          <w:b/>
-        </w:rPr>
-        <w:t xml:space="preserve">Statutes</w:t>
-      </w:r>
-    </w:p>
-    <w:p>
-      <w:pPr>
-        <w:pStyle w:val="SourceCode"/>
-      </w:pPr>
-      <w:r>
-        <w:rPr>
-          <w:rStyle w:val="VerbatimChar"/>
-        </w:rPr>
-        <w:t xml:space="preserve">15 U.S.C. § 1692e   1, 4</w:t>
-      </w:r>
-    </w:p>
-    <w:p>
-      <w:pPr>
-        <w:pStyle w:val="FirstParagraph"/>
-      </w:pPr>
-      <w:r>
-        <w:rPr>
-          <w:iCs/>
-          <w:i/>
-          <w:bCs/>
-          <w:b/>
-        </w:rPr>
-        <w:t xml:space="preserve">Regulations</w:t>
-      </w:r>
-    </w:p>
-    <w:p>
-      <w:pPr>
-        <w:pStyle w:val="SourceCode"/>
-      </w:pPr>
-      <w:r>
-        <w:rPr>
-          <w:rStyle w:val="VerbatimChar"/>
-        </w:rPr>
-        <w:t xml:space="preserve">12 C.F.R. § 1006.14 3, 6</w:t>
-      </w:r>
-    </w:p>
-    <w:p>
-      <w:pPr>
-        <w:pStyle w:val="FirstParagraph"/>
-      </w:pPr>
-      <w:r>
-        <w:rPr>
-          <w:iCs/>
-          <w:i/>
-          <w:bCs/>
-          <w:b/>
-        </w:rPr>
-        <w:t xml:space="preserve">Rules</w:t>
-      </w:r>
-    </w:p>
-    <w:p>
-      <w:pPr>
-        <w:pStyle w:val="SourceCode"/>
-      </w:pPr>
-      <w:r>
-        <w:rPr>
-          <w:rStyle w:val="VerbatimChar"/>
-        </w:rPr>
-        <w:t xml:space="preserve">Fed. R. App. P. 28  7</w:t>
-      </w:r>
-    </w:p>
     <w:bookmarkEnd w:id="21"/>
     <w:bookmarkStart w:id="22" w:name="statement-of-jurisdiction"/>
+    <w:p>
+      <w:pPr>
+        <w:pStyle w:val="FirstParagraph"/>
+      </w:pPr>
+      <w:r>
+        <w:t>Cases</w:t>
+      </w:r>
+    </w:p>
+    <w:p>
+      <w:pPr>
+        <w:pStyle w:val="SourceCode"/>
+      </w:pPr>
+      <w:r>
+        <w:t>Brunner v. Caldwell, 344 P.3d 901 (Wash. 2015)   6</w:t>
+      </w:r>
+    </w:p>
+    <w:p>
+      <w:pPr>
+        <w:pStyle w:val="SourceCode"/>
+      </w:pPr>
+      <w:r>
+        <w:t>Carmody v. Westfall Transit Auth., 512 F.3d 1042 (9th Cir. 2018)   3, 4, 5, 6</w:t>
+      </w:r>
+    </w:p>
+    <w:p>
+      <w:pPr>
+        <w:pStyle w:val="SourceCode"/>
+      </w:pPr>
+      <w:r>
+        <w:t>Delgado v. Pinewood Credit Services, Inc., 487 U.S. 213 (1988)   3, 5</w:t>
+      </w:r>
+    </w:p>
+    <w:p>
+      <w:pPr>
+        <w:pStyle w:val="SourceCode"/>
+      </w:pPr>
+      <w:r>
+        <w:t>Hartwell Industries v. National Labor Relations Board, 723 F.2d 388 (2d Cir. 1984)   5</w:t>
+      </w:r>
+    </w:p>
+    <w:p>
+      <w:pPr>
+        <w:pStyle w:val="FirstParagraph"/>
+      </w:pPr>
+      <w:r>
+        <w:t>Statutes</w:t>
+      </w:r>
+    </w:p>
+    <w:p>
+      <w:pPr>
+        <w:pStyle w:val="SourceCode"/>
+      </w:pPr>
+      <w:r>
+        <w:t>15 U.S.C. § 1692e   2, 4</w:t>
+      </w:r>
+    </w:p>
+    <w:p>
+      <w:pPr>
+        <w:pStyle w:val="SourceCode"/>
+      </w:pPr>
+      <w:r>
+        <w:t>28 U.S.C. § 1291   2</w:t>
+      </w:r>
+    </w:p>
+    <w:p>
+      <w:pPr>
+        <w:pStyle w:val="SourceCode"/>
+      </w:pPr>
+      <w:r>
+        <w:t>28 U.S.C. § 1331   1</w:t>
+      </w:r>
+    </w:p>
+    <w:p>
+      <w:pPr>
+        <w:pStyle w:val="FirstParagraph"/>
+      </w:pPr>
+      <w:r>
+        <w:t>Regulations</w:t>
+      </w:r>
+    </w:p>
+    <w:p>
+      <w:pPr>
+        <w:pStyle w:val="SourceCode"/>
+      </w:pPr>
+      <w:r>
+        <w:t>12 C.F.R. § 1006.14   3, 6</w:t>
+      </w:r>
+    </w:p>
+    <w:p>
+      <w:pPr>
+        <w:pStyle w:val="FirstParagraph"/>
+      </w:pPr>
+      <w:r>
+        <w:t>Rules</w:t>
+      </w:r>
+    </w:p>
+    <w:p>
+      <w:pPr>
+        <w:pStyle w:val="SourceCode"/>
+      </w:pPr>
+      <w:r>
+        <w:t>Fed. R. App. P. 28   6</w:t>
+      </w:r>
+    </w:p>
     <w:p>
       <w:pPr>
         <w:pStyle w:val="Heading1"/>

</xml_diff>